<commit_message>
Deploy preview for PR 2 🛫
</commit_message>
<xml_diff>
--- a/pr-preview/pr-2/chapters/chapter1.docx
+++ b/pr-preview/pr-2/chapters/chapter1.docx
@@ -537,7 +537,7 @@
         <w:t xml:space="preserve"> </w:t>
       </w:r>
       <w:r>
-        <w:t xml:space="preserve">c88c4f8</w:t>
+        <w:t xml:space="preserve">1994178</w:t>
       </w:r>
     </w:p>
     <w:p>
@@ -559,7 +559,7 @@
         <w:t xml:space="preserve"> </w:t>
       </w:r>
       <w:r>
-        <w:t xml:space="preserve">c88c4f8a63c08f807ae22339522a16b5b8847710</w:t>
+        <w:t xml:space="preserve">1994178114c3a90f9eecf1b261b6b5aa67f26385</w:t>
       </w:r>
     </w:p>
     <w:p>
@@ -581,7 +581,7 @@
         <w:t xml:space="preserve"> </w:t>
       </w:r>
       <w:r>
-        <w:t xml:space="preserve">2026-04-06 23:21:43 +0000</w:t>
+        <w:t xml:space="preserve">2026-04-06 23:35:50 +0000</w:t>
       </w:r>
     </w:p>
     <w:p>

</xml_diff>